<commit_message>
Fix admin manual formatting: repack docx with 7-Zip to preserve Word compatibility
Previous build used adm-zip which corrupted run ordering in the docx ZIP
structure, causing garbled text in Word. Repacked from clean source XML
using 7-Zip which preserves the ZIP format Word expects.

Co-Authored-By: Claude Sonnet 4.6 <noreply@anthropic.com>
</commit_message>
<xml_diff>
--- a/admin-manual.docx
+++ b/admin-manual.docx
@@ -2801,10 +2801,6 @@
           <w:ilvl w:val="2"/>
           <w:numId w:val="1"/>
         </w:numPr>
-        <w:tabs>
-          <w:tab w:pos="1009" w:val="left" w:leader="none"/>
-          <w:tab w:pos="1010" w:val="left" w:leader="none"/>
-        </w:tabs>
         <w:spacing w:line="240" w:lineRule="auto" w:before="56" w:after="0"/>
         <w:ind w:left="1010" w:right="0" w:hanging="301"/>
         <w:jc w:val="left"/>
@@ -2818,14 +2814,14 @@
           <w:color w:val="1C2820"/>
           <w:sz w:val="22"/>
         </w:rPr>
-        <w:t>Nines </w:t>
-      </w:r>
-      <w:r>
-        <w:rPr>
-          <w:color w:val="5A665F"/>
-          <w:sz w:val="22"/>
-        </w:rPr>
-        <w:t xml:space="preserve">– a 3-player points game. Requires exactly 3 players signed up. Every hole distributes exactly 9 points based on net scores: low score gets 5 pts, middle 3 pts, high 1 pt. Ties split the points (two-way low tie = 4/4/1, two-way high tie = 5/2/2, three-way tie = 3/3/3). The player with the most points at the end wins the entire pot. If two players tie for most points they split the pot. The scorecard shows each player’s net score per hole with points earned per cell and a running total in the footer.</w:t>
+        <w:t xml:space="preserve">Nines </w:t>
+      </w:r>
+      <w:r>
+        <w:rPr>
+          <w:color w:val="5A665F"/>
+          <w:sz w:val="22"/>
+        </w:rPr>
+        <w:t xml:space="preserve">– a 3-player points game. Requires exactly 3 players signed up. Every hole distributes 9 points based on net scores: low score gets 5 pts, middle 3 pts, high 1 pt. Ties split evenly. Player with most points wins the pot (bet x 3); tied players split the pot.</w:t>
       </w:r>
     </w:p>
     <w:p>

</xml_diff>

<commit_message>
Fix garbled GrossScoreBirdieOverride text in admin manual
Original docx had the feature name stored as individual scrambled characters
with extreme negative kerning (anti-copy protection artifact). Replaced with
clean plain-text run. Also re-added Nines section from clean source.

Co-Authored-By: Claude Sonnet 4.6 <noreply@anthropic.com>
</commit_message>
<xml_diff>
--- a/admin-manual.docx
+++ b/admin-manual.docx
@@ -2821,7 +2821,7 @@
           <w:color w:val="5A665F"/>
           <w:sz w:val="22"/>
         </w:rPr>
-        <w:t xml:space="preserve">– a 3-player points game. Requires exactly 3 players signed up. Every hole distributes 9 points based on net scores: low score gets 5 pts, middle 3 pts, high 1 pt. Ties split evenly. Player with most points wins the pot (bet x 3); tied players split the pot.</w:t>
+        <w:t xml:space="preserve">– a 3-player points game. Requires exactly 3 players signed up. Every hole distributes 9 points based on net scores: low score gets 5 pts, middle 3 pts, high 1 pt. Ties split evenly. Player with most points wins the pot (bet amount x 3); tied players split the pot.</w:t>
       </w:r>
     </w:p>
     <w:p>
@@ -2889,188 +2889,8 @@
       <w:r>
         <w:rPr>
           <w:color w:val="5A665F"/>
-          <w:spacing w:val="-1"/>
-        </w:rPr>
-        <w:t> G</w:t>
-      </w:r>
-      <w:r>
-        <w:rPr>
-          <w:color w:val="5A665F"/>
-          <w:spacing w:val="-4"/>
-        </w:rPr>
-        <w:t>r</w:t>
-      </w:r>
-      <w:r>
-        <w:rPr>
-          <w:color w:val="5A665F"/>
-          <w:spacing w:val="-112"/>
-        </w:rPr>
-        <w:t>o</w:t>
-      </w:r>
-      <w:r>
-        <w:rPr>
-          <w:color w:val="5A665F"/>
-        </w:rPr>
-        <w:t>s</w:t>
-      </w:r>
-      <w:r>
-        <w:rPr>
-          <w:color w:val="5A665F"/>
-          <w:spacing w:val="-68"/>
-        </w:rPr>
-        <w:t>c</w:t>
-      </w:r>
-      <w:r>
-        <w:rPr>
-          <w:color w:val="5A665F"/>
-          <w:spacing w:val="-19"/>
-        </w:rPr>
-        <w:t>s</w:t>
-      </w:r>
-      <w:r>
-        <w:rPr>
-          <w:color w:val="5A665F"/>
-          <w:spacing w:val="-98"/>
-        </w:rPr>
-        <w:t>o</w:t>
-      </w:r>
-      <w:r>
-        <w:rPr>
-          <w:color w:val="5A665F"/>
-          <w:spacing w:val="11"/>
-        </w:rPr>
-        <w:t>s</w:t>
-      </w:r>
-      <w:r>
-        <w:rPr>
-          <w:color w:val="5A665F"/>
-          <w:spacing w:val="-39"/>
-        </w:rPr>
-        <w:t>r</w:t>
-      </w:r>
-      <w:r>
-        <w:rPr>
-          <w:color w:val="5A665F"/>
-          <w:spacing w:val="-81"/>
-        </w:rPr>
-        <w:t>B</w:t>
-      </w:r>
-      <w:r>
-        <w:rPr>
-          <w:color w:val="5A665F"/>
-          <w:spacing w:val="-29"/>
-        </w:rPr>
-        <w:t>e</w:t>
-      </w:r>
-      <w:r>
-        <w:rPr>
-          <w:color w:val="5A665F"/>
-          <w:spacing w:val="-22"/>
-        </w:rPr>
-        <w:t>i</w:t>
-      </w:r>
-      <w:r>
-        <w:rPr>
-          <w:color w:val="5A665F"/>
-          <w:spacing w:val="-65"/>
-        </w:rPr>
-        <w:t>s</w:t>
-      </w:r>
-      <w:r>
-        <w:rPr>
-          <w:color w:val="5A665F"/>
-          <w:spacing w:val="-4"/>
-        </w:rPr>
-        <w:t>r</w:t>
-      </w:r>
-      <w:r>
-        <w:rPr>
-          <w:color w:val="5A665F"/>
-          <w:spacing w:val="-76"/>
-        </w:rPr>
-        <w:t>d</w:t>
-      </w:r>
-      <w:r>
-        <w:rPr>
-          <w:color w:val="5A665F"/>
-          <w:spacing w:val="-18"/>
-        </w:rPr>
-        <w:t>c</w:t>
-      </w:r>
-      <w:r>
-        <w:rPr>
-          <w:color w:val="5A665F"/>
-          <w:spacing w:val="-33"/>
-        </w:rPr>
-        <w:t>i</w:t>
-      </w:r>
-      <w:r>
-        <w:rPr>
-          <w:color w:val="5A665F"/>
-          <w:spacing w:val="-84"/>
-        </w:rPr>
-        <w:t>o</w:t>
-      </w:r>
-      <w:r>
-        <w:rPr>
-          <w:color w:val="5A665F"/>
-          <w:spacing w:val="-27"/>
-        </w:rPr>
-        <w:t>e</w:t>
-      </w:r>
-      <w:r>
-        <w:rPr>
-          <w:color w:val="5A665F"/>
-          <w:spacing w:val="-40"/>
-        </w:rPr>
-        <w:t>u</w:t>
-      </w:r>
-      <w:r>
-        <w:rPr>
-          <w:color w:val="5A665F"/>
-          <w:spacing w:val="-106"/>
-        </w:rPr>
-        <w:t>O</w:t>
-      </w:r>
-      <w:r>
-        <w:rPr>
-          <w:color w:val="5A665F"/>
-          <w:spacing w:val="-10"/>
-        </w:rPr>
-        <w:t>n</w:t>
-      </w:r>
-      <w:r>
-        <w:rPr>
-          <w:color w:val="5A665F"/>
-          <w:spacing w:val="-90"/>
-        </w:rPr>
-        <w:t>v</w:t>
-      </w:r>
-      <w:r>
-        <w:rPr>
-          <w:color w:val="5A665F"/>
-        </w:rPr>
-        <w:t>t</w:t>
-      </w:r>
-      <w:r>
-        <w:rPr>
-          <w:color w:val="5A665F"/>
-          <w:spacing w:val="-42"/>
-        </w:rPr>
-        <w:t>.</w:t>
-      </w:r>
-      <w:r>
-        <w:rPr>
-          <w:color w:val="5A665F"/>
-          <w:spacing w:val="-1"/>
-        </w:rPr>
-        <w:t>err</w:t>
-      </w:r>
-      <w:r>
-        <w:rPr>
-          <w:color w:val="5A665F"/>
-        </w:rPr>
-        <w:t>ide</w:t>
+        </w:rPr>
+        <w:t xml:space="preserve"> GrossScoreBirdieOverride</w:t>
       </w:r>
       <w:r>
         <w:rPr>

</xml_diff>